<commit_message>
Add use case, class, and sequence diagrams to project report
Co-Authored-By: Claude Sonnet 4.6 <noreply@anthropic.com>
</commit_message>
<xml_diff>
--- a/docs/rapport_projet.docx
+++ b/docs/rapport_projet.docx
@@ -932,6 +932,55 @@
       </w:pPr>
       <w:r>
         <w:t>3. Modèle de données</w:t>
+      </w:r>
+    </w:p>
+    <w:p>
+      <w:pPr>
+        <w:jc w:val="center"/>
+      </w:pPr>
+      <w:r>
+        <w:drawing>
+          <wp:inline xmlns:a="http://schemas.openxmlformats.org/drawingml/2006/main" xmlns:pic="http://schemas.openxmlformats.org/drawingml/2006/picture">
+            <wp:extent cx="5486400" cy="3359889"/>
+            <wp:docPr id="2" name="Picture 2"/>
+            <wp:cNvGraphicFramePr>
+              <a:graphicFrameLocks noChangeAspect="1"/>
+            </wp:cNvGraphicFramePr>
+            <a:graphic>
+              <a:graphicData uri="http://schemas.openxmlformats.org/drawingml/2006/picture">
+                <pic:pic>
+                  <pic:nvPicPr>
+                    <pic:cNvPr id="0" name="class.png"/>
+                    <pic:cNvPicPr/>
+                  </pic:nvPicPr>
+                  <pic:blipFill>
+                    <a:blip r:embed="rId10"/>
+                    <a:stretch>
+                      <a:fillRect/>
+                    </a:stretch>
+                  </pic:blipFill>
+                  <pic:spPr>
+                    <a:xfrm>
+                      <a:off x="0" y="0"/>
+                      <a:ext cx="5486400" cy="3359889"/>
+                    </a:xfrm>
+                    <a:prstGeom prst="rect"/>
+                  </pic:spPr>
+                </pic:pic>
+              </a:graphicData>
+            </a:graphic>
+          </wp:inline>
+        </w:drawing>
+      </w:r>
+    </w:p>
+    <w:p>
+      <w:pPr>
+        <w:jc w:val="center"/>
+      </w:pPr>
+      <w:r>
+        <w:rPr>
+          <w:i/>
+        </w:rPr>
       </w:r>
     </w:p>
     <w:p>
@@ -3183,6 +3232,55 @@
     </w:p>
     <w:p>
       <w:pPr>
+        <w:jc w:val="center"/>
+      </w:pPr>
+      <w:r>
+        <w:drawing>
+          <wp:inline xmlns:a="http://schemas.openxmlformats.org/drawingml/2006/main" xmlns:pic="http://schemas.openxmlformats.org/drawingml/2006/picture">
+            <wp:extent cx="5486400" cy="3778306"/>
+            <wp:docPr id="1" name="Picture 1"/>
+            <wp:cNvGraphicFramePr>
+              <a:graphicFrameLocks noChangeAspect="1"/>
+            </wp:cNvGraphicFramePr>
+            <a:graphic>
+              <a:graphicData uri="http://schemas.openxmlformats.org/drawingml/2006/picture">
+                <pic:pic>
+                  <pic:nvPicPr>
+                    <pic:cNvPr id="0" name="use_case.png"/>
+                    <pic:cNvPicPr/>
+                  </pic:nvPicPr>
+                  <pic:blipFill>
+                    <a:blip r:embed="rId9"/>
+                    <a:stretch>
+                      <a:fillRect/>
+                    </a:stretch>
+                  </pic:blipFill>
+                  <pic:spPr>
+                    <a:xfrm>
+                      <a:off x="0" y="0"/>
+                      <a:ext cx="5486400" cy="3778306"/>
+                    </a:xfrm>
+                    <a:prstGeom prst="rect"/>
+                  </pic:spPr>
+                </pic:pic>
+              </a:graphicData>
+            </a:graphic>
+          </wp:inline>
+        </w:drawing>
+      </w:r>
+    </w:p>
+    <w:p>
+      <w:pPr>
+        <w:jc w:val="center"/>
+      </w:pPr>
+      <w:r>
+        <w:rPr>
+          <w:i/>
+        </w:rPr>
+      </w:r>
+    </w:p>
+    <w:p>
+      <w:pPr>
         <w:pStyle w:val="Heading2"/>
       </w:pPr>
       <w:r>
@@ -3671,6 +3769,55 @@
       </w:pPr>
       <w:r>
         <w:t>5. Système d'entretiens et notifications</w:t>
+      </w:r>
+    </w:p>
+    <w:p>
+      <w:pPr>
+        <w:jc w:val="center"/>
+      </w:pPr>
+      <w:r>
+        <w:drawing>
+          <wp:inline xmlns:a="http://schemas.openxmlformats.org/drawingml/2006/main" xmlns:pic="http://schemas.openxmlformats.org/drawingml/2006/picture">
+            <wp:extent cx="5486400" cy="3778306"/>
+            <wp:docPr id="3" name="Picture 3"/>
+            <wp:cNvGraphicFramePr>
+              <a:graphicFrameLocks noChangeAspect="1"/>
+            </wp:cNvGraphicFramePr>
+            <a:graphic>
+              <a:graphicData uri="http://schemas.openxmlformats.org/drawingml/2006/picture">
+                <pic:pic>
+                  <pic:nvPicPr>
+                    <pic:cNvPr id="0" name="sequence.png"/>
+                    <pic:cNvPicPr/>
+                  </pic:nvPicPr>
+                  <pic:blipFill>
+                    <a:blip r:embed="rId11"/>
+                    <a:stretch>
+                      <a:fillRect/>
+                    </a:stretch>
+                  </pic:blipFill>
+                  <pic:spPr>
+                    <a:xfrm>
+                      <a:off x="0" y="0"/>
+                      <a:ext cx="5486400" cy="3778306"/>
+                    </a:xfrm>
+                    <a:prstGeom prst="rect"/>
+                  </pic:spPr>
+                </pic:pic>
+              </a:graphicData>
+            </a:graphic>
+          </wp:inline>
+        </w:drawing>
+      </w:r>
+    </w:p>
+    <w:p>
+      <w:pPr>
+        <w:jc w:val="center"/>
+      </w:pPr>
+      <w:r>
+        <w:rPr>
+          <w:i/>
+        </w:rPr>
       </w:r>
     </w:p>
     <w:p>

</xml_diff>

<commit_message>
Improve report diagrams: full class diagram (6 entities), detailed sequences, GPS trip sequence
Co-Authored-By: Claude Sonnet 4.6 <noreply@anthropic.com>
</commit_message>
<xml_diff>
--- a/docs/rapport_projet.docx
+++ b/docs/rapport_projet.docx
@@ -941,8 +941,8 @@
       <w:r>
         <w:drawing>
           <wp:inline xmlns:a="http://schemas.openxmlformats.org/drawingml/2006/main" xmlns:pic="http://schemas.openxmlformats.org/drawingml/2006/picture">
-            <wp:extent cx="5486400" cy="3359889"/>
-            <wp:docPr id="2" name="Picture 2"/>
+            <wp:extent cx="5943600" cy="3867587"/>
+            <wp:docPr id="1" name="Picture 1"/>
             <wp:cNvGraphicFramePr>
               <a:graphicFrameLocks noChangeAspect="1"/>
             </wp:cNvGraphicFramePr>
@@ -950,11 +950,11 @@
               <a:graphicData uri="http://schemas.openxmlformats.org/drawingml/2006/picture">
                 <pic:pic>
                   <pic:nvPicPr>
-                    <pic:cNvPr id="0" name="class.png"/>
+                    <pic:cNvPr id="0" name="class_diag.png"/>
                     <pic:cNvPicPr/>
                   </pic:nvPicPr>
                   <pic:blipFill>
-                    <a:blip r:embed="rId10"/>
+                    <a:blip r:embed="rId12"/>
                     <a:stretch>
                       <a:fillRect/>
                     </a:stretch>
@@ -962,7 +962,7 @@
                   <pic:spPr>
                     <a:xfrm>
                       <a:off x="0" y="0"/>
-                      <a:ext cx="5486400" cy="3359889"/>
+                      <a:ext cx="5943600" cy="3867587"/>
                     </a:xfrm>
                     <a:prstGeom prst="rect"/>
                   </pic:spPr>
@@ -971,6 +971,18 @@
             </a:graphic>
           </wp:inline>
         </w:drawing>
+      </w:r>
+    </w:p>
+    <w:p>
+      <w:pPr>
+        <w:jc w:val="center"/>
+      </w:pPr>
+      <w:r>
+        <w:rPr>
+          <w:i/>
+          <w:sz w:val="18"/>
+        </w:rPr>
+        <w:t>Figure 2 — Diagramme de classes</w:t>
       </w:r>
     </w:p>
     <w:p>
@@ -3237,8 +3249,8 @@
       <w:r>
         <w:drawing>
           <wp:inline xmlns:a="http://schemas.openxmlformats.org/drawingml/2006/main" xmlns:pic="http://schemas.openxmlformats.org/drawingml/2006/picture">
-            <wp:extent cx="5486400" cy="3778306"/>
-            <wp:docPr id="1" name="Picture 1"/>
+            <wp:extent cx="5943600" cy="4093164"/>
+            <wp:docPr id="2" name="Picture 2"/>
             <wp:cNvGraphicFramePr>
               <a:graphicFrameLocks noChangeAspect="1"/>
             </wp:cNvGraphicFramePr>
@@ -3250,7 +3262,7 @@
                     <pic:cNvPicPr/>
                   </pic:nvPicPr>
                   <pic:blipFill>
-                    <a:blip r:embed="rId9"/>
+                    <a:blip r:embed="rId13"/>
                     <a:stretch>
                       <a:fillRect/>
                     </a:stretch>
@@ -3258,7 +3270,7 @@
                   <pic:spPr>
                     <a:xfrm>
                       <a:off x="0" y="0"/>
-                      <a:ext cx="5486400" cy="3778306"/>
+                      <a:ext cx="5943600" cy="4093164"/>
                     </a:xfrm>
                     <a:prstGeom prst="rect"/>
                   </pic:spPr>
@@ -3267,6 +3279,18 @@
             </a:graphic>
           </wp:inline>
         </w:drawing>
+      </w:r>
+    </w:p>
+    <w:p>
+      <w:pPr>
+        <w:jc w:val="center"/>
+      </w:pPr>
+      <w:r>
+        <w:rPr>
+          <w:i/>
+          <w:sz w:val="18"/>
+        </w:rPr>
+        <w:t>Figure 1 — Diagramme des cas d'utilisation</w:t>
       </w:r>
     </w:p>
     <w:p>
@@ -3778,7 +3802,7 @@
       <w:r>
         <w:drawing>
           <wp:inline xmlns:a="http://schemas.openxmlformats.org/drawingml/2006/main" xmlns:pic="http://schemas.openxmlformats.org/drawingml/2006/picture">
-            <wp:extent cx="5486400" cy="3778306"/>
+            <wp:extent cx="5943600" cy="4095632"/>
             <wp:docPr id="3" name="Picture 3"/>
             <wp:cNvGraphicFramePr>
               <a:graphicFrameLocks noChangeAspect="1"/>
@@ -3787,11 +3811,11 @@
               <a:graphicData uri="http://schemas.openxmlformats.org/drawingml/2006/picture">
                 <pic:pic>
                   <pic:nvPicPr>
-                    <pic:cNvPr id="0" name="sequence.png"/>
+                    <pic:cNvPr id="0" name="seq_entretien.png"/>
                     <pic:cNvPicPr/>
                   </pic:nvPicPr>
                   <pic:blipFill>
-                    <a:blip r:embed="rId11"/>
+                    <a:blip r:embed="rId14"/>
                     <a:stretch>
                       <a:fillRect/>
                     </a:stretch>
@@ -3799,7 +3823,7 @@
                   <pic:spPr>
                     <a:xfrm>
                       <a:off x="0" y="0"/>
-                      <a:ext cx="5486400" cy="3778306"/>
+                      <a:ext cx="5943600" cy="4095632"/>
                     </a:xfrm>
                     <a:prstGeom prst="rect"/>
                   </pic:spPr>
@@ -3808,6 +3832,69 @@
             </a:graphic>
           </wp:inline>
         </w:drawing>
+      </w:r>
+    </w:p>
+    <w:p>
+      <w:pPr>
+        <w:jc w:val="center"/>
+      </w:pPr>
+      <w:r>
+        <w:rPr>
+          <w:i/>
+          <w:sz w:val="18"/>
+        </w:rPr>
+        <w:t>Figure 3 — Séquence: Marquer un entretien effectué</w:t>
+      </w:r>
+    </w:p>
+    <w:p>
+      <w:pPr>
+        <w:jc w:val="center"/>
+      </w:pPr>
+      <w:r>
+        <w:drawing>
+          <wp:inline xmlns:a="http://schemas.openxmlformats.org/drawingml/2006/main" xmlns:pic="http://schemas.openxmlformats.org/drawingml/2006/picture">
+            <wp:extent cx="5943600" cy="4300279"/>
+            <wp:docPr id="4" name="Picture 4"/>
+            <wp:cNvGraphicFramePr>
+              <a:graphicFrameLocks noChangeAspect="1"/>
+            </wp:cNvGraphicFramePr>
+            <a:graphic>
+              <a:graphicData uri="http://schemas.openxmlformats.org/drawingml/2006/picture">
+                <pic:pic>
+                  <pic:nvPicPr>
+                    <pic:cNvPr id="0" name="seq_gps.png"/>
+                    <pic:cNvPicPr/>
+                  </pic:nvPicPr>
+                  <pic:blipFill>
+                    <a:blip r:embed="rId15"/>
+                    <a:stretch>
+                      <a:fillRect/>
+                    </a:stretch>
+                  </pic:blipFill>
+                  <pic:spPr>
+                    <a:xfrm>
+                      <a:off x="0" y="0"/>
+                      <a:ext cx="5943600" cy="4300279"/>
+                    </a:xfrm>
+                    <a:prstGeom prst="rect"/>
+                  </pic:spPr>
+                </pic:pic>
+              </a:graphicData>
+            </a:graphic>
+          </wp:inline>
+        </w:drawing>
+      </w:r>
+    </w:p>
+    <w:p>
+      <w:pPr>
+        <w:jc w:val="center"/>
+      </w:pPr>
+      <w:r>
+        <w:rPr>
+          <w:i/>
+          <w:sz w:val="18"/>
+        </w:rPr>
+        <w:t>Figure 4 — Séquence: Suivi de trajet GPS</w:t>
       </w:r>
     </w:p>
     <w:p>

</xml_diff>